<commit_message>
Remove blank pages from Bluebook tracker
</commit_message>
<xml_diff>
--- a/Courses/SAT/Practice Tests/Bluebook Timing and Confidence Tracker.docx
+++ b/Courses/SAT/Practice Tests/Bluebook Timing and Confidence Tracker.docx
@@ -143,12 +143,8 @@
       </w:r>
     </w:p>
     <w:p>
-      <w:r>
-        <w:br w:type="page"/>
-      </w:r>
-    </w:p>
-    <w:p>
       <w:pPr>
+        <w:pageBreakBefore/>
         <w:spacing w:after="40"/>
       </w:pPr>
       <w:r>
@@ -687,12 +683,8 @@
       </w:tr>
     </w:tbl>
     <w:p>
-      <w:r>
-        <w:br w:type="page"/>
-      </w:r>
-    </w:p>
-    <w:p>
       <w:pPr>
+        <w:pageBreakBefore/>
         <w:spacing w:after="40"/>
       </w:pPr>
       <w:r>
@@ -1231,12 +1223,8 @@
       </w:tr>
     </w:tbl>
     <w:p>
-      <w:r>
-        <w:br w:type="page"/>
-      </w:r>
-    </w:p>
-    <w:p>
       <w:pPr>
+        <w:pageBreakBefore/>
         <w:spacing w:after="40"/>
       </w:pPr>
       <w:r>
@@ -1775,12 +1763,8 @@
       </w:tr>
     </w:tbl>
     <w:p>
-      <w:r>
-        <w:br w:type="page"/>
-      </w:r>
-    </w:p>
-    <w:p>
       <w:pPr>
+        <w:pageBreakBefore/>
         <w:spacing w:after="40"/>
       </w:pPr>
       <w:r>
@@ -2319,12 +2303,8 @@
       </w:tr>
     </w:tbl>
     <w:p>
-      <w:r>
-        <w:br w:type="page"/>
-      </w:r>
-    </w:p>
-    <w:p>
       <w:pPr>
+        <w:pageBreakBefore/>
         <w:spacing w:after="40"/>
       </w:pPr>
       <w:r>
@@ -2863,12 +2843,8 @@
       </w:tr>
     </w:tbl>
     <w:p>
-      <w:r>
-        <w:br w:type="page"/>
-      </w:r>
-    </w:p>
-    <w:p>
       <w:pPr>
+        <w:pageBreakBefore/>
         <w:spacing w:after="40"/>
       </w:pPr>
       <w:r>
@@ -3407,12 +3383,8 @@
       </w:tr>
     </w:tbl>
     <w:p>
-      <w:r>
-        <w:br w:type="page"/>
-      </w:r>
-    </w:p>
-    <w:p>
       <w:pPr>
+        <w:pageBreakBefore/>
         <w:spacing w:after="40"/>
       </w:pPr>
       <w:r>
@@ -3892,12 +3864,8 @@
       </w:tr>
     </w:tbl>
     <w:p>
-      <w:r>
-        <w:br w:type="page"/>
-      </w:r>
-    </w:p>
-    <w:p>
       <w:pPr>
+        <w:pageBreakBefore/>
         <w:spacing w:after="40"/>
       </w:pPr>
       <w:r>
@@ -4377,12 +4345,8 @@
       </w:tr>
     </w:tbl>
     <w:p>
-      <w:r>
-        <w:br w:type="page"/>
-      </w:r>
-    </w:p>
-    <w:p>
       <w:pPr>
+        <w:pageBreakBefore/>
         <w:spacing w:after="40"/>
       </w:pPr>
       <w:r>
@@ -4818,12 +4782,8 @@
       </w:tr>
     </w:tbl>
     <w:p>
-      <w:r>
-        <w:br w:type="page"/>
-      </w:r>
-    </w:p>
-    <w:p>
       <w:pPr>
+        <w:pageBreakBefore/>
         <w:spacing w:after="40"/>
       </w:pPr>
       <w:r>
@@ -5303,12 +5263,8 @@
       </w:tr>
     </w:tbl>
     <w:p>
-      <w:r>
-        <w:br w:type="page"/>
-      </w:r>
-    </w:p>
-    <w:p>
       <w:pPr>
+        <w:pageBreakBefore/>
         <w:spacing w:after="40"/>
       </w:pPr>
       <w:r>
@@ -5788,12 +5744,8 @@
       </w:tr>
     </w:tbl>
     <w:p>
-      <w:r>
-        <w:br w:type="page"/>
-      </w:r>
-    </w:p>
-    <w:p>
       <w:pPr>
+        <w:pageBreakBefore/>
         <w:spacing w:after="40"/>
       </w:pPr>
       <w:r>
@@ -6228,11 +6180,6 @@
         </w:tc>
       </w:tr>
     </w:tbl>
-    <w:p>
-      <w:r>
-        <w:br w:type="page"/>
-      </w:r>
-    </w:p>
     <w:sectPr>
       <w:pgSz w:w="12240" w:h="15840"/>
       <w:pgMar w:top="540" w:right="720" w:bottom="540" w:left="720" w:header="300" w:footer="300" w:gutter="0"/>

</xml_diff>